<commit_message>
phase 1 final submission commit on Oct 18
</commit_message>
<xml_diff>
--- a/Phase I/Team_EV_AI_Usage_and_Teamwork_Report.docx
+++ b/Phase I/Team_EV_AI_Usage_and_Teamwork_Report.docx
@@ -17,7 +17,7 @@
         <w:jc w:val="center"/>
       </w:pPr>
       <w:r>
-        <w:t>Team EV · CptS 484 Project THEIA · Phase I · October 17, 2026</w:t>
+        <w:t>Team EV · CptS 484 Project THEIA · Phase I · October 18, 2026</w:t>
       </w:r>
     </w:p>
     <w:p>
@@ -62,7 +62,7 @@
         <w:pStyle w:val="3"/>
       </w:pPr>
       <w:r>
-        <w:t>The record is uneven. James Zuniga kept a detailed log; Zichuo Wang, Young Kim, and Austin Aragon posted shorter notes in Discord; Justus Jones submitted no evidence. The report says so where it matters instead of filling the gaps.</w:t>
+        <w:t>The record is uneven. James Zuniga kept a detailed log; Zichuo Wang, Young Kim, and Austin Aragon posted shorter notes in Discord; Justus Jones added a log of his Claude Code sessions on Oct 18, after this report was first assembled.</w:t>
       </w:r>
     </w:p>
     <w:bookmarkEnd w:id="0"/>
@@ -542,7 +542,7 @@
               <w:rPr>
                 <w:sz w:val="20"/>
               </w:rPr>
-              <w:t>Weekly check-in messages; review feedback on all work products; WRS templates (front matter, §2, §3); final assembly, consistency check, plan and report drafting</w:t>
+              <w:t>Weekly check-in messages; review feedback on all work products; WRS templates (front matter, §2, §3); final assembly, consistency check, plan and report drafting; comparing Justus Jones’s §3 draft with the assembled WRS and merging it (Oct 18)</w:t>
             </w:r>
           </w:p>
         </w:tc>
@@ -614,7 +614,7 @@
               <w:rPr>
                 <w:sz w:val="20"/>
               </w:rPr>
-              <w:t>—</w:t>
+              <w:t>Claude Code (Claude Opus 5.5)</w:t>
             </w:r>
           </w:p>
         </w:tc>
@@ -631,7 +631,7 @@
               <w:rPr>
                 <w:sz w:val="20"/>
               </w:rPr>
-              <w:t>No AI usage evidence submitted</w:t>
+              <w:t>Orienting in the plan and repo; drafting an independent WRS §3 from WRS §2; checking that draft against the course documents</w:t>
             </w:r>
           </w:p>
         </w:tc>
@@ -648,7 +648,7 @@
               <w:rPr>
                 <w:sz w:val="20"/>
               </w:rPr>
-              <w:t>—</w:t>
+              <w:t>D-3 WRS §3 (draft, Oct 18)</w:t>
             </w:r>
           </w:p>
         </w:tc>
@@ -712,10 +712,13 @@
           <w:b/>
           <w:bCs/>
         </w:rPr>
-        <w:t>D-3 WRS §3 Improved Understanding (Zichuo Wang, Young Kim).</w:t>
-      </w:r>
-      <w:r>
-        <w:t xml:space="preserve"> Zichuo drafted §3 (Problems, Goals, objectives, FR/NFR with specifications, traceability) with AI help on Oct 14 as a template for the §3 owner, labeled as AI-generated. When the original owner did not deliver, Zichuo and Young completed it at assembly, checking every requirement against §2, the recorded slides, and the prototype.</w:t>
+        <w:t>D-3 WRS §3 Improved Understanding (Justus Jones, Zichuo Wang).</w:t>
+      </w:r>
+      <w:r>
+        <w:rPr>
+          <w:bCs/>
+        </w:rPr>
+        <w:t xml:space="preserve"> Zichuo drafted §3 (Problems, Goals, objectives, FR/NFR with specifications, traceability) with AI help on Oct 14 as a template for the §3 owner, labeled as AI-generated. Justus Jones, the owner, did not reply during the final week, so Zichuo completed §3 at assembly, checking every requirement against §2, the recorded slides, and the prototype. On Oct 18 Justus used Claude Code to write an independent §3 from Austin’s §2 (WRS-Section2-Updated.md), deliberately without the assembled version, and then had it check the draft against the World Assumptions Masterlist, the Requirements Review Checklist, the Preliminary Definition, the project specification, and the sample WRS. Zichuo compared his draft with the assembled §3 using Claude Code, and the team merged its additions into WRS v1.1 (§5, items 6 and 7).</w:t>
       </w:r>
     </w:p>
     <w:p>
@@ -742,7 +745,7 @@
           <w:b/>
           <w:bCs/>
         </w:rPr>
-        <w:t>D-5 Project Plan (Zichuo Wang, James Zuniga).</w:t>
+        <w:t>D-5 Project Plan (Zichuo Wang, Young Kim).</w:t>
       </w:r>
       <w:r>
         <w:t xml:space="preserve"> AI helped draft the weekly check-ins (e.g., the Oct 1 Week 3 check-in) and the final plan update. The schedule, roles, and reassignment decisions were made by the team liaison.</w:t>
@@ -1093,7 +1096,7 @@
               <w:rPr>
                 <w:sz w:val="20"/>
               </w:rPr>
-              <w:t>Zichuo Wang: draft labeled AI-generated, every item traced to a §2 issue</w:t>
+              <w:t>Zichuo Wang (co-author): assembled §3 labeled AI-generated, every item traced to a §2 issue. Justus Jones (owner): his Oct 18 draft checked against the Masterlist, Review Checklist, Preliminary Definition, spec, and sample WRS</w:t>
             </w:r>
           </w:p>
         </w:tc>
@@ -1110,7 +1113,7 @@
               <w:rPr>
                 <w:sz w:val="20"/>
               </w:rPr>
-              <w:t>Young Kim (co-author); cross-check against slides and prototype at assembly</w:t>
+              <w:t>Young Kim (review); cross-check against slides and prototype at assembly; Justus Jones’s draft checked against the same before merging</w:t>
             </w:r>
           </w:p>
         </w:tc>
@@ -1320,7 +1323,7 @@
         </w:numPr>
       </w:pPr>
       <w:r>
-        <w:t>at assembly, how to resolve conflicts between work products (Zichuo Wang): the recorded slides are fixed, the WRS follows the slides, and the prototype and manual follow the WRS; one warning distance (5 steps) everywhere; the D-2 and D-3 reassignments.</w:t>
+        <w:t>at assembly, how to resolve conflicts between work products (Zichuo Wang): the recorded slides are fixed, the WRS follows the slides, and the prototype and manual follow the WRS; one warning distance (5 steps) everywhere; the role changes; and which parts of Justus Jones’s late §3 draft to merge.</w:t>
       </w:r>
     </w:p>
     <w:bookmarkEnd w:id="3"/>
@@ -1473,7 +1476,43 @@
         <w:pStyle w:val="23"/>
       </w:pPr>
       <w:r>
-        <w:t>Each was fixed in the direction the team set (Appendix B of the WRS lists all 12 before/after changes). The AI found the conflicts; the resolution rules were the liaison’s.</w:t>
+        <w:t>Each was fixed in the direction the team set. The AI found the conflicts; the resolution rules were the liaison’s.</w:t>
+      </w:r>
+    </w:p>
+    <w:p>
+      <w:pPr>
+        <w:pStyle w:val="3"/>
+      </w:pPr>
+      <w:r>
+        <w:rPr>
+          <w:b/>
+          <w:bCs/>
+        </w:rPr>
+        <w:t>6. Justus Jones’s own checks (D-3, Oct 18).</w:t>
+      </w:r>
+      <w:r>
+        <w:rPr>
+          <w:bCs/>
+        </w:rPr>
+        <w:t xml:space="preserve"> Justus’s log records that the AI’s first role list came from the repository README rather than the plan, so he corrected it; that the Masterlist check found a world assumption contradicting it (users “use” a cane or dog, where the Masterlist says they “might”) and four missing assumptions, which he fixed; and that he rejected a suggested diagram and reverted README edits he had not asked for. (Appendix A.5.)</w:t>
+      </w:r>
+    </w:p>
+    <w:p>
+      <w:pPr>
+        <w:pStyle w:val="3"/>
+      </w:pPr>
+      <w:r>
+        <w:rPr>
+          <w:b/>
+          <w:bCs/>
+        </w:rPr>
+        <w:t>7. A late §3 draft that conflicted with the recorded scenarios (D-3, Oct 18).</w:t>
+      </w:r>
+      <w:r>
+        <w:rPr>
+          <w:bCs/>
+        </w:rPr>
+        <w:t xml:space="preserve"> Justus’s §3 was built from §2 alone, before the slides, prototype, and manual were reconciled. Checked against them, it conflicted in 11 places, among others: the command “Blocked” instead of “This way is blocked”; an off-route threshold of 15 s or 5 m (room-level beacons cannot measure 5 m) instead of 30 s; “Help” texting at once instead of the four-option prompt on prototype Screen 4; Comfortable mode allowing 50% extra time and Safe mode avoiding crowds, against Scenario 4; no arrival requirement, although the prototype and manual use one; and a prototype mapping based on the mock-up before its fixes (“two-finger tap”). These parts were not adopted. His priorities, NFR acceptance criteria, error handling (no route, wrong floor, no cellular signal), and Preliminary Definition coverage table were merged, rewritten to the WRS’s IDs and numbers.</w:t>
       </w:r>
     </w:p>
     <w:bookmarkEnd w:id="4"/>
@@ -1652,7 +1691,7 @@
               <w:rPr>
                 <w:sz w:val="20"/>
               </w:rPr>
-              <w:t>Liaison; Project Plan (preliminary and final); weekly check-ins and review feedback; WRS templates; WRS §3 after the reassignment; prototype co-author; this report; final assembly and consistency check</w:t>
+              <w:t>Liaison; Project Plan (preliminary and final); weekly check-ins and review feedback; WRS templates; WRS §3 co-author (completed §3 at assembly); prototype co-author; this report; final assembly and consistency check</w:t>
             </w:r>
           </w:p>
         </w:tc>
@@ -1707,7 +1746,7 @@
               <w:rPr>
                 <w:sz w:val="20"/>
               </w:rPr>
-              <w:t>AS-IS/TO-BE slides and the recorded presentation; Top Priority analysis; WRS §2 co-author; Project Plan co-author</w:t>
+              <w:t>AS-IS/TO-BE slides and the recorded presentation; Top Priority analysis; WRS §2 co-author</w:t>
             </w:r>
           </w:p>
         </w:tc>
@@ -1817,7 +1856,7 @@
               <w:rPr>
                 <w:sz w:val="20"/>
               </w:rPr>
-              <w:t>Prototype mock-up (5 screens, 10 images) and preliminary user manual; WRS §3 co-author; this report’s co-author</w:t>
+              <w:t>Prototype mock-up (5 screens, 10 images) and preliminary user manual; Project Plan co-author; this report’s co-author</w:t>
             </w:r>
           </w:p>
         </w:tc>
@@ -1872,7 +1911,7 @@
               <w:rPr>
                 <w:sz w:val="20"/>
               </w:rPr>
-              <w:t>Assigned WRS §3 owner and §2 co-author. Did not reply to the team or deliver work during the final week, and produced no work product for this submission</w:t>
+              <w:t>WRS §3 owner. Did not reply to the team during the final week; on Oct 18 submitted an independent §3 draft, whose priorities, acceptance criteria, error handling, and Preliminary Definition coverage were merged into WRS v1.1, and his AI usage log</w:t>
             </w:r>
           </w:p>
         </w:tc>
@@ -1890,7 +1929,18 @@
         <w:t>What worked.</w:t>
       </w:r>
       <w:r>
-        <w:t xml:space="preserve"> The co-author model limited the damage of a missing member: §3 already had a co-author and a draft, so it could be completed in the last week without losing a work product. The Oct 14 feedback round, with fixed deadlines (Thu Oct 15 fixes, Fri Oct 16 video, Sat Oct 17 assembly, Sun Oct 18 submission), held.</w:t>
+        <w:rPr>
+          <w:bCs/>
+        </w:rPr>
+        <w:t xml:space="preserve"> The co-author model limited the damage when an owner went silent: §3 already had a co-author and a draft, so it was co</w:t>
+      </w:r>
+      <w:bookmarkStart w:id="13" w:name="_GoBack"/>
+      <w:bookmarkEnd w:id="13"/>
+      <w:r>
+        <w:rPr>
+          <w:bCs/>
+        </w:rPr>
+        <w:t>mpleted in the last week without losing a work product, and the owner’s late draft could still be reviewed and merged. The Oct 14 feedback round, with fixed deadlines (Thu Oct 15 fixes, Fri Oct 16 video, Sat Oct 17 assembly, Sun Oct 18 submission), held.</w:t>
       </w:r>
     </w:p>
     <w:p>
@@ -1905,7 +1955,10 @@
         <w:t>What we would change.</w:t>
       </w:r>
       <w:r>
-        <w:t xml:space="preserve"> The WRS §2 internal deadline (Oct 4) slipped to Oct 16, and AI evidence was collected at the end instead of continuously, which is why parts of this record are thin.</w:t>
+        <w:rPr>
+          <w:bCs/>
+        </w:rPr>
+        <w:t xml:space="preserve"> The WRS §2 internal deadline (Oct 4) slipped to Oct 16, and AI evidence was collected at the end instead of continuously, which is why parts of this record are thin. The D-3 owner’s draft arrived after assembly, so it was merged on the deadline day instead of being reviewed at a weekly checkpoint.</w:t>
       </w:r>
     </w:p>
     <w:bookmarkEnd w:id="5"/>
@@ -3704,12 +3757,388 @@
         <w:pStyle w:val="23"/>
       </w:pPr>
       <w:r>
-        <w:t>No AI usage evidence was submitted.</w:t>
+        <w:t>From Justus Jones’s AI_Usage_Log.md (Jones_Justus_AI_Usage_Report folder), added Oct 18. Tool in every session: Claude Code (Claude Opus 5.5). Quoted as written, except that two fields of the third session, which the log leaves unfilled (“What I changed” and the check of the FR9, FR11, and FR12 rows against the prototype), are left out.</w:t>
       </w:r>
       <w:bookmarkEnd w:id="11"/>
       <w:bookmarkStart w:id="12" w:name="a.6-final-assembly-records"/>
-      <w:bookmarkStart w:id="13" w:name="_GoBack"/>
-      <w:bookmarkEnd w:id="13"/>
+    </w:p>
+    <w:p>
+      <w:pPr>
+        <w:pStyle w:val="3"/>
+      </w:pPr>
+      <w:r>
+        <w:rPr>
+          <w:b/>
+          <w:bCs/>
+        </w:rPr>
+        <w:t>Oct 18 · Repo orientation and D-3 scope.</w:t>
+      </w:r>
+    </w:p>
+    <w:p>
+      <w:pPr>
+        <w:pStyle w:val="3"/>
+      </w:pPr>
+      <w:r>
+        <w:rPr>
+          <w:b/>
+          <w:bCs/>
+        </w:rPr>
+        <w:t>What I asked for:</w:t>
+      </w:r>
+      <w:r>
+        <w:rPr>
+          <w:bCs/>
+        </w:rPr>
+        <w:t xml:space="preserve"> a read-through of the Preliminary Project Plan and the repo, then which work products were mine (D-3 owner, D-5 secondary per plan §2.3) and how D-3 depends on the others.</w:t>
+      </w:r>
+    </w:p>
+    <w:p>
+      <w:pPr>
+        <w:pStyle w:val="3"/>
+      </w:pPr>
+      <w:r>
+        <w:rPr>
+          <w:b/>
+          <w:bCs/>
+        </w:rPr>
+        <w:t>What came back:</w:t>
+      </w:r>
+      <w:r>
+        <w:rPr>
+          <w:bCs/>
+        </w:rPr>
+        <w:t xml:space="preserve"> a summary of the project, the WRS (§2 Issues = D-2, §3 Improved Understanding = D-3), and the dependencies D-2 → D-3 → D-4/D-1/D-5/D-6. Useful: the summary and dependencies. Rejected: the first role list it gave, which came from the repo README rather than plan §2.3. I supplied the §2.3 table to correct it.</w:t>
+      </w:r>
+    </w:p>
+    <w:p>
+      <w:pPr>
+        <w:pStyle w:val="3"/>
+      </w:pPr>
+      <w:r>
+        <w:rPr>
+          <w:b/>
+          <w:bCs/>
+        </w:rPr>
+        <w:t>What I changed:</w:t>
+      </w:r>
+      <w:r>
+        <w:rPr>
+          <w:bCs/>
+        </w:rPr>
+        <w:t xml:space="preserve"> confirmed roles against plan §2.3 myself.</w:t>
+      </w:r>
+    </w:p>
+    <w:p>
+      <w:pPr>
+        <w:pStyle w:val="3"/>
+      </w:pPr>
+      <w:r>
+        <w:rPr>
+          <w:b/>
+          <w:bCs/>
+        </w:rPr>
+        <w:t>Verified against:</w:t>
+      </w:r>
+      <w:r>
+        <w:rPr>
+          <w:bCs/>
+        </w:rPr>
+        <w:t xml:space="preserve"> Team_EV_Preliminary_Project_Plan.docx §2.3; 03-wrs/README.md.</w:t>
+      </w:r>
+    </w:p>
+    <w:p>
+      <w:pPr>
+        <w:pStyle w:val="3"/>
+      </w:pPr>
+      <w:r>
+        <w:rPr>
+          <w:b/>
+          <w:bCs/>
+        </w:rPr>
+        <w:t>Oct 18 · WRS §3 draft (D-3).</w:t>
+      </w:r>
+    </w:p>
+    <w:p>
+      <w:pPr>
+        <w:pStyle w:val="3"/>
+      </w:pPr>
+      <w:r>
+        <w:rPr>
+          <w:b/>
+          <w:bCs/>
+        </w:rPr>
+        <w:t>What I asked for:</w:t>
+      </w:r>
+      <w:r>
+        <w:rPr>
+          <w:bCs/>
+        </w:rPr>
+        <w:t xml:space="preserve"> a fresh WRS §3 for D-3, built only from Austin’s §2 (WRS-Section2-Updated.md), without using the D-3 version Zichuo submitted on my behalf. I checked out the commit before it (fc0a30e) so that version wasn’t in the working tree.</w:t>
+      </w:r>
+    </w:p>
+    <w:p>
+      <w:pPr>
+        <w:pStyle w:val="3"/>
+      </w:pPr>
+      <w:r>
+        <w:rPr>
+          <w:b/>
+          <w:bCs/>
+        </w:rPr>
+        <w:t>What came back:</w:t>
+      </w:r>
+      <w:r>
+        <w:rPr>
+          <w:bCs/>
+        </w:rPr>
+        <w:t xml:space="preserve"> one draft with Problems P1–P8, Goals G1–G8, domain (ID1–ID3), stakeholders, world assumptions, objectives FO1–FO10/NFO1–NFO7, FR1–FR13, NFR1–NFR7, and three traceability tables. It kept the IDs §2 already cites in its “Satisfied by” rows. Useful: the structure and traceability. Problems found later (see next entry): one world assumption contradicted the Masterlist, four Masterlist assumptions were missing, and there were no priorities or error behavior.</w:t>
+      </w:r>
+    </w:p>
+    <w:p>
+      <w:pPr>
+        <w:pStyle w:val="3"/>
+      </w:pPr>
+      <w:r>
+        <w:rPr>
+          <w:b/>
+          <w:bCs/>
+        </w:rPr>
+        <w:t>What I changed:</w:t>
+      </w:r>
+      <w:r>
+        <w:rPr>
+          <w:bCs/>
+        </w:rPr>
+        <w:t xml:space="preserve"> renamed it to WRS-Section3-Updated.md and set Austin Aragon as co-author.</w:t>
+      </w:r>
+    </w:p>
+    <w:p>
+      <w:pPr>
+        <w:pStyle w:val="3"/>
+      </w:pPr>
+      <w:r>
+        <w:rPr>
+          <w:b/>
+          <w:bCs/>
+        </w:rPr>
+        <w:t>Verified against:</w:t>
+      </w:r>
+      <w:r>
+        <w:rPr>
+          <w:bCs/>
+        </w:rPr>
+        <w:t xml:space="preserve"> WRS §2 “Satisfied by” rows; plan §2.3.</w:t>
+      </w:r>
+    </w:p>
+    <w:p>
+      <w:pPr>
+        <w:pStyle w:val="3"/>
+      </w:pPr>
+      <w:r>
+        <w:rPr>
+          <w:b/>
+          <w:bCs/>
+        </w:rPr>
+        <w:t>Oct 18 · Checking §3 against course documents.</w:t>
+      </w:r>
+    </w:p>
+    <w:p>
+      <w:pPr>
+        <w:pStyle w:val="3"/>
+      </w:pPr>
+      <w:r>
+        <w:rPr>
+          <w:b/>
+          <w:bCs/>
+        </w:rPr>
+        <w:t>What I asked for:</w:t>
+      </w:r>
+      <w:r>
+        <w:rPr>
+          <w:bCs/>
+        </w:rPr>
+        <w:t xml:space="preserve"> check the draft against the course documents from Canvas, one at a time, and fix what didn’t match.</w:t>
+      </w:r>
+    </w:p>
+    <w:p>
+      <w:pPr>
+        <w:pStyle w:val="3"/>
+      </w:pPr>
+      <w:r>
+        <w:rPr>
+          <w:b/>
+          <w:bCs/>
+        </w:rPr>
+        <w:t>What came back:</w:t>
+      </w:r>
+    </w:p>
+    <w:p>
+      <w:pPr>
+        <w:pStyle w:val="24"/>
+        <w:numPr>
+          <w:ilvl w:val="0"/>
+          <w:numId w:val="1"/>
+        </w:numPr>
+      </w:pPr>
+      <w:r>
+        <w:t>World Assumptions Masterlist v1.0: the draft said users use a cane or dog; the Masterlist says they might. Fixed. Added the four missing assumptions (English, smartphone accessibility experience, emergency dial-out, room-to-room only) and a Source column marking each assumption as Masterlist or Added.</w:t>
+      </w:r>
+    </w:p>
+    <w:p>
+      <w:pPr>
+        <w:pStyle w:val="24"/>
+        <w:numPr>
+          <w:ilvl w:val="0"/>
+          <w:numId w:val="1"/>
+        </w:numPr>
+      </w:pPr>
+      <w:r>
+        <w:t>Requirements Review Checklist: added a priority for every requirement, error behavior for FR1/FR2/FR3/FR10, and removed a design detail (a specific gesture) from FR1.</w:t>
+      </w:r>
+    </w:p>
+    <w:p>
+      <w:pPr>
+        <w:pStyle w:val="24"/>
+        <w:numPr>
+          <w:ilvl w:val="0"/>
+          <w:numId w:val="1"/>
+        </w:numPr>
+      </w:pPr>
+      <w:r>
+        <w:t>Preliminary Definition v1.0: mapped every statement to §3 (new table §3.3.4). FR10 only texted the caretaker though the Definition says “calls and messages”; fixed.</w:t>
+      </w:r>
+    </w:p>
+    <w:p>
+      <w:pPr>
+        <w:pStyle w:val="24"/>
+        <w:numPr>
+          <w:ilvl w:val="0"/>
+          <w:numId w:val="1"/>
+        </w:numPr>
+      </w:pPr>
+      <w:r>
+        <w:t>Project Specification I v2.0 and the sample WRS: §3 covers everything §III.2.2 asks for. Added §3.3.5 mapping each FR to the prototype, as the sample does, and the facing direction to FR1 to match the prototype’s “Where am I?”.</w:t>
+      </w:r>
+    </w:p>
+    <w:p>
+      <w:pPr>
+        <w:pStyle w:val="3"/>
+      </w:pPr>
+      <w:r>
+        <w:rPr>
+          <w:b/>
+          <w:bCs/>
+        </w:rPr>
+        <w:t>Rejected:</w:t>
+      </w:r>
+      <w:r>
+        <w:rPr>
+          <w:bCs/>
+        </w:rPr>
+        <w:t xml:space="preserve"> a suggestion to add a diagram; neither the spec nor our plan requires one.</w:t>
+      </w:r>
+    </w:p>
+    <w:p>
+      <w:pPr>
+        <w:pStyle w:val="3"/>
+      </w:pPr>
+      <w:r>
+        <w:rPr>
+          <w:b/>
+          <w:bCs/>
+        </w:rPr>
+        <w:t>Verified against:</w:t>
+      </w:r>
+      <w:r>
+        <w:rPr>
+          <w:bCs/>
+        </w:rPr>
+        <w:t xml:space="preserve"> Preliminary Definition v1.0; World Assumptions Masterlist v1.0; Requirements Review Checklist; Project Specification I v2.0 §III.2.2; 484 - WRS.pdf (sample); Theia Prototype Mock-Up.</w:t>
+      </w:r>
+    </w:p>
+    <w:p>
+      <w:pPr>
+        <w:pStyle w:val="3"/>
+      </w:pPr>
+      <w:r>
+        <w:rPr>
+          <w:b/>
+          <w:bCs/>
+        </w:rPr>
+        <w:t>Oct 18 · Repo housekeeping and recovery.</w:t>
+      </w:r>
+    </w:p>
+    <w:p>
+      <w:pPr>
+        <w:pStyle w:val="3"/>
+      </w:pPr>
+      <w:r>
+        <w:rPr>
+          <w:b/>
+          <w:bCs/>
+        </w:rPr>
+        <w:t>What I asked for:</w:t>
+      </w:r>
+      <w:r>
+        <w:rPr>
+          <w:bCs/>
+        </w:rPr>
+        <w:t xml:space="preserve"> role fixes in the 03-wrs files to match plan §2.3, this log, git guidance, and later a rebuild of my files after I accidentally deleted my local clone.</w:t>
+      </w:r>
+    </w:p>
+    <w:p>
+      <w:pPr>
+        <w:pStyle w:val="3"/>
+      </w:pPr>
+      <w:r>
+        <w:rPr>
+          <w:b/>
+          <w:bCs/>
+        </w:rPr>
+        <w:t>What came back:</w:t>
+      </w:r>
+      <w:r>
+        <w:rPr>
+          <w:bCs/>
+        </w:rPr>
+        <w:t xml:space="preserve"> edits to 03-wrs/README.md and the §3 header. It also edited the other folders’ READMEs, which I hadn’t asked for. Rejected: those extra edits, which I reverted. After the deletion it rebuilt §3 and this log from our conversation in my fork; I re-checked IDs and traceability in the rebuilt file.</w:t>
+      </w:r>
+    </w:p>
+    <w:p>
+      <w:pPr>
+        <w:pStyle w:val="3"/>
+      </w:pPr>
+      <w:r>
+        <w:rPr>
+          <w:b/>
+          <w:bCs/>
+        </w:rPr>
+        <w:t>What I changed:</w:t>
+      </w:r>
+      <w:r>
+        <w:rPr>
+          <w:bCs/>
+        </w:rPr>
+        <w:t xml:space="preserve"> kept only the 03-wrs changes. I did all git operations myself; the AI made no commits.</w:t>
+      </w:r>
+    </w:p>
+    <w:p>
+      <w:pPr>
+        <w:pStyle w:val="3"/>
+      </w:pPr>
+      <w:r>
+        <w:rPr>
+          <w:b/>
+          <w:bCs/>
+        </w:rPr>
+        <w:t>Verified against:</w:t>
+      </w:r>
+      <w:r>
+        <w:rPr>
+          <w:bCs/>
+        </w:rPr>
+        <w:t xml:space="preserve"> plan §2.3.</w:t>
+      </w:r>
     </w:p>
     <w:bookmarkEnd w:id="6"/>
     <w:bookmarkEnd w:id="12"/>
@@ -4013,7 +4442,7 @@
     <w:lsdException w:unhideWhenUsed="0" w:uiPriority="0" w:semiHidden="0" w:name="HTML Sample"/>
     <w:lsdException w:unhideWhenUsed="0" w:uiPriority="0" w:semiHidden="0" w:name="HTML Typewriter"/>
     <w:lsdException w:unhideWhenUsed="0" w:uiPriority="0" w:semiHidden="0" w:name="HTML Variable"/>
-    <w:lsdException w:unhideWhenUsed="0" w:uiPriority="0" w:semiHidden="0" w:name="Normal Table"/>
+    <w:lsdException w:qFormat="1" w:unhideWhenUsed="0" w:uiPriority="0" w:semiHidden="0" w:name="Normal Table"/>
     <w:lsdException w:unhideWhenUsed="0" w:uiPriority="0" w:semiHidden="0" w:name="annotation subject"/>
     <w:lsdException w:unhideWhenUsed="0" w:uiPriority="0" w:semiHidden="0" w:name="Table Simple 1"/>
     <w:lsdException w:unhideWhenUsed="0" w:uiPriority="0" w:semiHidden="0" w:name="Table Simple 2"/>
@@ -4376,6 +4805,7 @@
   </w:style>
   <w:style w:type="table" w:default="1" w:styleId="18">
     <w:name w:val="Normal Table"/>
+    <w:qFormat/>
     <w:uiPriority w:val="0"/>
     <w:tblPr>
       <w:tblCellMar>
@@ -4545,6 +4975,7 @@
     <w:name w:val="Subtitle Char"/>
     <w:basedOn w:val="19"/>
     <w:link w:val="16"/>
+    <w:qFormat/>
     <w:uiPriority w:val="11"/>
     <w:rPr>
       <w:rFonts w:eastAsiaTheme="majorEastAsia" w:cstheme="majorBidi"/>

</xml_diff>